<commit_message>
Kryptera resultatpaketet med lösenord (v1.0.9)
- scriptet frågar efter lösenord (minst 12 tecken) i början; zip krypteras med AES-256-CBC + HMAC-SHA256, PBKDF2 600000 varv
- Unprotect-Rapportkit.ps1 packar upp (PowerShell 5.1 och 7)
- -NoEncrypt och -ZipPassword; lösenordet skrivs aldrig till logg eller kör-om-kommando
- tester, README, KUNDINFO och användarguide uppdaterade

Co-Authored-By: Claude Sonnet 5.5 <noreply@anthropic.com>
</commit_message>
<xml_diff>
--- a/docs/Anvandarguide-Azure-Rapportkit.docx
+++ b/docs/Anvandarguide-Azure-Rapportkit.docx
@@ -239,6 +239,19 @@
       </w:pPr>
       <w:r>
         <w:t xml:space="preserve">Svara på frågorna: tenant-ID (förslag visas), var resultatet ska sparas, och bekräfta eventuella varningar.</w:t>
+      </w:r>
+    </w:p>
+    <w:p>
+      <w:pPr>
+        <w:pStyle w:val="ListParagraph"/>
+        <w:numPr>
+          <w:ilvl w:val="0"/>
+          <w:numId w:val="3"/>
+        </w:numPr>
+        <w:spacing w:after="60"/>
+      </w:pPr>
+      <w:r>
+        <w:t xml:space="preserve">Välj ett lösenord för resultatpaketet (minst 12 tecken, skrivs två gånger). Det används för att kryptera filen som lämnas över. Anteckna det och skicka det till mottagaren på ett annat sätt än filen.</w:t>
       </w:r>
     </w:p>
     <w:p>
@@ -1465,7 +1478,7 @@
                 <w:sz w:val="20"/>
                 <w:szCs w:val="20"/>
               </w:rPr>
-              <w:t xml:space="preserve">rapportkit_&lt;tenant&gt;_&lt;period&gt;.zip + .sha256</w:t>
+              <w:t xml:space="preserve">rapportkit_&lt;tenant&gt;_&lt;period&gt;.zip.rkenc + .sha256</w:t>
             </w:r>
           </w:p>
         </w:tc>
@@ -1493,7 +1506,7 @@
                 <w:sz w:val="20"/>
                 <w:szCs w:val="20"/>
               </w:rPr>
-              <w:t xml:space="preserve">Paket för överlämning, med kontrollsumma</w:t>
+              <w:t xml:space="preserve">Lösenordskrypterat paket för överlämning (AES-256), med kontrollsumma</w:t>
             </w:r>
           </w:p>
         </w:tc>
@@ -1516,7 +1529,63 @@
           <w:b/>
           <w:bCs/>
         </w:rPr>
-        <w:t xml:space="preserve">Zip-filen är inte krypterad. Resultatet är konfidentiellt: lämna det bara via överenskommen kanal, i enlighet med NDA och personuppgiftsbiträdesavtal.</w:t>
+        <w:t xml:space="preserve">Resultatet är konfidentiellt. Skicka .rkenc-filen (och gärna .sha256-filen) med e-post eller delad plats, och lösenordet via en annan väg, till exempel SMS eller telefon. Mappen med okrypterade resultat ligger kvar på datorn: ta bort den när uppdraget är klart. Lämna över i enlighet med NDA och personuppgiftsbiträdesavtal.</w:t>
+      </w:r>
+    </w:p>
+    <w:p>
+      <w:pPr>
+        <w:pStyle w:val="Heading2"/>
+        <w:spacing w:after="100" w:before="200"/>
+      </w:pPr>
+      <w:r>
+        <w:t xml:space="preserve">Packa upp paketet (mottagaren)</w:t>
+      </w:r>
+    </w:p>
+    <w:p>
+      <w:pPr>
+        <w:pStyle w:val="ListParagraph"/>
+        <w:numPr>
+          <w:ilvl w:val="0"/>
+          <w:numId w:val="3"/>
+        </w:numPr>
+        <w:spacing w:after="60"/>
+      </w:pPr>
+      <w:r>
+        <w:t xml:space="preserve">Spara .rkenc-filen (och .sha256) i en mapp, till exempel C:\Temp.</w:t>
+      </w:r>
+    </w:p>
+    <w:p>
+      <w:pPr>
+        <w:pStyle w:val="ListParagraph"/>
+        <w:numPr>
+          <w:ilvl w:val="0"/>
+          <w:numId w:val="3"/>
+        </w:numPr>
+        <w:spacing w:after="60"/>
+      </w:pPr>
+      <w:r>
+        <w:t xml:space="preserve">Kör: .\Unprotect-Rapportkit.ps1 -Path C:\Temp\rapportkit_&lt;tenant&gt;_&lt;period&gt;.zip.rkenc</w:t>
+      </w:r>
+    </w:p>
+    <w:p>
+      <w:pPr>
+        <w:pStyle w:val="ListParagraph"/>
+        <w:numPr>
+          <w:ilvl w:val="0"/>
+          <w:numId w:val="3"/>
+        </w:numPr>
+        <w:spacing w:after="60"/>
+      </w:pPr>
+      <w:r>
+        <w:t xml:space="preserve">Skriv lösenordet. Skriptet kontrollerar kontrollsumman och att filen är oskadd, och packar upp i en mapp bredvid. Öppna rapport.html.</w:t>
+      </w:r>
+    </w:p>
+    <w:p>
+      <w:pPr>
+        <w:spacing w:after="120"/>
+      </w:pPr>
+      <w:r>
+        <w:t xml:space="preserve">Fel lösenord eller en ändrad fil ger felet "Fel lösenord, eller så har filen ändrats eller skadats". Skriptet följer med i repot och i offlinepaketet.</w:t>
       </w:r>
     </w:p>
     <w:p>
@@ -2035,6 +2104,64 @@
                 <w:sz w:val="20"/>
                 <w:szCs w:val="20"/>
               </w:rPr>
+              <w:t xml:space="preserve">-NoEncrypt</w:t>
+            </w:r>
+          </w:p>
+        </w:tc>
+        <w:tc>
+          <w:tcPr>
+            <w:tcW w:type="dxa" w:w="5660"/>
+            <w:tcBorders>
+              <w:top w:val="single" w:color="BBBBBB" w:sz="4"/>
+              <w:left w:val="single" w:color="BBBBBB" w:sz="4"/>
+              <w:bottom w:val="single" w:color="BBBBBB" w:sz="4"/>
+              <w:right w:val="single" w:color="BBBBBB" w:sz="4"/>
+            </w:tcBorders>
+            <w:tcMar>
+              <w:top w:type="dxa" w:w="60"/>
+              <w:left w:type="dxa" w:w="100"/>
+              <w:bottom w:type="dxa" w:w="60"/>
+              <w:right w:type="dxa" w:w="100"/>
+            </w:tcMar>
+          </w:tcPr>
+          <w:p>
+            <w:r>
+              <w:rPr>
+                <w:b w:val="false"/>
+                <w:bCs w:val="false"/>
+                <w:sz w:val="20"/>
+                <w:szCs w:val="20"/>
+              </w:rPr>
+              <w:t xml:space="preserve">Kryptera inte paketet (bara om resultatet inte lämnar datorn)</w:t>
+            </w:r>
+          </w:p>
+        </w:tc>
+      </w:tr>
+      <w:tr>
+        <w:tc>
+          <w:tcPr>
+            <w:tcW w:type="dxa" w:w="3700"/>
+            <w:tcBorders>
+              <w:top w:val="single" w:color="BBBBBB" w:sz="4"/>
+              <w:left w:val="single" w:color="BBBBBB" w:sz="4"/>
+              <w:bottom w:val="single" w:color="BBBBBB" w:sz="4"/>
+              <w:right w:val="single" w:color="BBBBBB" w:sz="4"/>
+            </w:tcBorders>
+            <w:tcMar>
+              <w:top w:type="dxa" w:w="60"/>
+              <w:left w:type="dxa" w:w="100"/>
+              <w:bottom w:type="dxa" w:w="60"/>
+              <w:right w:type="dxa" w:w="100"/>
+            </w:tcMar>
+          </w:tcPr>
+          <w:p>
+            <w:r>
+              <w:rPr>
+                <w:b w:val="false"/>
+                <w:bCs w:val="false"/>
+                <w:sz w:val="20"/>
+                <w:szCs w:val="20"/>
+              </w:rPr>
               <w:t xml:space="preserve">-KeepLogin</w:t>
             </w:r>
           </w:p>
@@ -2498,6 +2625,64 @@
                 <w:szCs w:val="20"/>
               </w:rPr>
               <w:t xml:space="preserve">Be IT undanta resultatmappen och verktygsmappen tillfälligt.</w:t>
+            </w:r>
+          </w:p>
+        </w:tc>
+      </w:tr>
+      <w:tr>
+        <w:tc>
+          <w:tcPr>
+            <w:tcW w:type="dxa" w:w="3300"/>
+            <w:tcBorders>
+              <w:top w:val="single" w:color="BBBBBB" w:sz="4"/>
+              <w:left w:val="single" w:color="BBBBBB" w:sz="4"/>
+              <w:bottom w:val="single" w:color="BBBBBB" w:sz="4"/>
+              <w:right w:val="single" w:color="BBBBBB" w:sz="4"/>
+            </w:tcBorders>
+            <w:tcMar>
+              <w:top w:type="dxa" w:w="60"/>
+              <w:left w:type="dxa" w:w="100"/>
+              <w:bottom w:type="dxa" w:w="60"/>
+              <w:right w:type="dxa" w:w="100"/>
+            </w:tcMar>
+          </w:tcPr>
+          <w:p>
+            <w:r>
+              <w:rPr>
+                <w:b w:val="false"/>
+                <w:bCs w:val="false"/>
+                <w:sz w:val="20"/>
+                <w:szCs w:val="20"/>
+              </w:rPr>
+              <w:t xml:space="preserve">Lösenordet glömt</w:t>
+            </w:r>
+          </w:p>
+        </w:tc>
+        <w:tc>
+          <w:tcPr>
+            <w:tcW w:type="dxa" w:w="6060"/>
+            <w:tcBorders>
+              <w:top w:val="single" w:color="BBBBBB" w:sz="4"/>
+              <w:left w:val="single" w:color="BBBBBB" w:sz="4"/>
+              <w:bottom w:val="single" w:color="BBBBBB" w:sz="4"/>
+              <w:right w:val="single" w:color="BBBBBB" w:sz="4"/>
+            </w:tcBorders>
+            <w:tcMar>
+              <w:top w:type="dxa" w:w="60"/>
+              <w:left w:type="dxa" w:w="100"/>
+              <w:bottom w:type="dxa" w:w="60"/>
+              <w:right w:type="dxa" w:w="100"/>
+            </w:tcMar>
+          </w:tcPr>
+          <w:p>
+            <w:r>
+              <w:rPr>
+                <w:b w:val="false"/>
+                <w:bCs w:val="false"/>
+                <w:sz w:val="20"/>
+                <w:szCs w:val="20"/>
+              </w:rPr>
+              <w:t xml:space="preserve">Det kan inte återskapas. Kör om scriptet (kopior av resultatet finns i resultatmappen på datorn).</w:t>
             </w:r>
           </w:p>
         </w:tc>

</xml_diff>